<commit_message>
Split Item Title into Role, Company, Location and use numbered menus
</commit_message>
<xml_diff>
--- a/Base_Template.docx
+++ b/Base_Template.docx
@@ -106,7 +106,23 @@
           <w:sz w:val="20"/>
           <w:szCs w:val="20"/>
         </w:rPr>
-        <w:t>{{ item.title }}</w:t>
+        <w:t xml:space="preserve">{% if item.role %}{{ item.role }}{% endif %}</w:t>
+      </w:r>
+      <w:r>
+        <w:rPr>
+          <w:sz w:val="20"/>
+          <w:szCs w:val="20"/>
+        </w:rPr>
+        <w:t xml:space="preserve">{% if item.company %}{% if item.role %}, {% endif %}{{ item.company }}{% endif %}</w:t>
+      </w:r>
+      <w:r>
+        <w:rPr>
+          <w:b/>
+          <w:bCs/>
+          <w:sz w:val="20"/>
+          <w:szCs w:val="20"/>
+        </w:rPr>
+        <w:t xml:space="preserve">{% if item.location %} – {{ item.location }}{% endif %}</w:t>
       </w:r>
       <w:r>
         <w:tab/>

</xml_diff>

<commit_message>
Fix template margins and add Skills section formatting
</commit_message>
<xml_diff>
--- a/Base_Template.docx
+++ b/Base_Template.docx
@@ -80,6 +80,62 @@
           <w:szCs w:val="22"/>
         </w:rPr>
         <w:t>{{ section.title|upper }}</w:t>
+      </w:r>
+    </w:p>
+    <w:p>
+      <w:r>
+        <w:t>{%p if section.is_skills %}</w:t>
+      </w:r>
+    </w:p>
+    <w:p>
+      <w:r>
+        <w:t>{%p for skill in section['items'] %}</w:t>
+      </w:r>
+    </w:p>
+    <w:p>
+      <w:pPr>
+        <w:widowControl w:val="0"/>
+        <w:tabs>
+          <w:tab w:val="right" w:pos="11088"/>
+        </w:tabs>
+        <w:spacing w:before="0" w:line="252" w:lineRule="auto"/>
+        <w:jc w:val="both"/>
+        <w:rPr>
+          <w:rFonts w:eastAsia="Times New Roman" w:cs="Calibri"/>
+          <w:color w:val="000000" w:themeColor="text1"/>
+          <w:sz w:val="20"/>
+          <w:szCs w:val="20"/>
+        </w:rPr>
+      </w:pPr>
+      <w:r>
+        <w:rPr>
+          <w:rFonts w:eastAsia="Times New Roman" w:cs="Calibri"/>
+          <w:b/>
+          <w:bCs/>
+          <w:color w:val="000000" w:themeColor="text1"/>
+          <w:sz w:val="20"/>
+          <w:szCs w:val="20"/>
+        </w:rPr>
+        <w:t xml:space="preserve">{{ skill.category }}: </w:t>
+      </w:r>
+      <w:r>
+        <w:rPr>
+          <w:rFonts w:eastAsia="Times New Roman" w:cs="Calibri"/>
+          <w:color w:val="000000" w:themeColor="text1"/>
+          <w:sz w:val="20"/>
+          <w:szCs w:val="20"/>
+        </w:rPr>
+        <w:t xml:space="preserve">{{ skill.text }}</w:t>
+      </w:r>
+    </w:p>
+    <w:p>
+      <w:r>
+        <w:t>{%p endfor %}</w:t>
+      </w:r>
+    </w:p>
+    <w:p>
+      <w:r>
+        <w:t>{%p else %}</w:t>
       </w:r>
     </w:p>
     <w:p>
@@ -259,9 +315,26 @@
     </w:p>
     <w:p>
       <w:r>
+        <w:t>{%p endif %}</w:t>
+      </w:r>
+    </w:p>
+    <w:p>
+      <w:r>
         <w:t>{%p endfor %}</w:t>
       </w:r>
     </w:p>
+    <w:sectPr>
+      <w:headerReference w:type="even" r:id="rId10"/>
+      <w:footerReference w:type="even" r:id="rId11"/>
+      <w:footerReference w:type="default" r:id="rId12"/>
+      <w:headerReference w:type="first" r:id="rId13"/>
+      <w:footerReference w:type="first" r:id="rId14"/>
+      <w:pgSz w:w="12240" w:h="15840"/>
+      <w:pgMar w:top="432" w:right="576" w:bottom="432" w:left="576" w:header="14" w:footer="14" w:gutter="0"/>
+      <w:pgNumType w:start="1"/>
+      <w:cols w:space="720"/>
+      <w:docGrid w:linePitch="326"/>
+    </w:sectPr>
   </w:body>
 </w:document>
 </file>

</xml_diff>

<commit_message>
Support subtitle_right for right-aligned text like GPA
</commit_message>
<xml_diff>
--- a/Base_Template.docx
+++ b/Base_Template.docx
@@ -195,7 +195,7 @@
     </w:p>
     <w:p>
       <w:r>
-        <w:t>{%p if item.subtitle %}</w:t>
+        <w:t>{%p if item.subtitle or item.subtitle_right %}</w:t>
       </w:r>
     </w:p>
     <w:p>
@@ -221,6 +221,30 @@
           <w:szCs w:val="20"/>
         </w:rPr>
         <w:t>{{ item.subtitle }}</w:t>
+      </w:r>
+      <w:r>
+        <w:t xml:space="preserve">{% if item.subtitle_right %}</w:t>
+      </w:r>
+      <w:r>
+        <w:rPr>
+          <w:rFonts w:eastAsia="Times New Roman" w:cs="Calibri"/>
+          <w:color w:val="000000" w:themeColor="text1"/>
+          <w:sz w:val="20"/>
+          <w:szCs w:val="20"/>
+        </w:rPr>
+        <w:tab/>
+      </w:r>
+      <w:r>
+        <w:rPr>
+          <w:rFonts w:eastAsia="Times New Roman" w:cs="Calibri"/>
+          <w:color w:val="000000" w:themeColor="text1"/>
+          <w:sz w:val="20"/>
+          <w:szCs w:val="20"/>
+        </w:rPr>
+        <w:t>{{ item.subtitle_right }}</w:t>
+      </w:r>
+      <w:r>
+        <w:t xml:space="preserve">{% endif %}</w:t>
       </w:r>
     </w:p>
     <w:p>

</xml_diff>

<commit_message>
Fix newline under empty item headers
</commit_message>
<xml_diff>
--- a/Base_Template.docx
+++ b/Base_Template.docx
@@ -144,6 +144,11 @@
       </w:r>
     </w:p>
     <w:p>
+      <w:r>
+        <w:t>{%p if item.role or item.company or item.location or item.date %}</w:t>
+      </w:r>
+    </w:p>
+    <w:p>
       <w:pPr>
         <w:widowControl w:val="0"/>
         <w:tabs>
@@ -191,6 +196,11 @@
           <w:szCs w:val="20"/>
         </w:rPr>
         <w:t>{{ item.date }}</w:t>
+      </w:r>
+    </w:p>
+    <w:p>
+      <w:r>
+        <w:t>{%p endif %}</w:t>
       </w:r>
     </w:p>
     <w:p>

</xml_diff>